<commit_message>
add power BI card and other changes
</commit_message>
<xml_diff>
--- a/Assets/Links/Links.docx
+++ b/Assets/Links/Links.docx
@@ -3,84 +3,145 @@
 <w:document xmlns:wpc="http://schemas.microsoft.com/office/word/2010/wordprocessingCanvas" xmlns:cx="http://schemas.microsoft.com/office/drawing/2014/chartex" xmlns:cx1="http://schemas.microsoft.com/office/drawing/2015/9/8/chartex" xmlns:cx2="http://schemas.microsoft.com/office/drawing/2015/10/21/chartex" xmlns:cx3="http://schemas.microsoft.com/office/drawing/2016/5/9/chartex" xmlns:cx4="http://schemas.microsoft.com/office/drawing/2016/5/10/chartex" xmlns:cx5="http://schemas.microsoft.com/office/drawing/2016/5/11/chartex" xmlns:cx6="http://schemas.microsoft.com/office/drawing/2016/5/12/chartex" xmlns:cx7="http://schemas.microsoft.com/office/drawing/2016/5/13/chartex" xmlns:cx8="http://schemas.microsoft.com/office/drawing/2016/5/14/chartex" xmlns:mc="http://schemas.openxmlformats.org/markup-compatibility/2006" xmlns:aink="http://schemas.microsoft.com/office/drawing/2016/ink" xmlns:am3d="http://schemas.microsoft.com/office/drawing/2017/model3d" xmlns:o="urn:schemas-microsoft-com:office:office" xmlns:oel="http://schemas.microsoft.com/office/2019/extlst" xmlns:r="http://schemas.openxmlformats.org/officeDocument/2006/relationships" xmlns:m="http://schemas.openxmlformats.org/officeDocument/2006/math" xmlns:v="urn:schemas-microsoft-com:vml" xmlns:wp14="http://schemas.microsoft.com/office/word/2010/wordprocessingDrawing" xmlns:wp="http://schemas.openxmlformats.org/drawingml/2006/wordprocessingDrawing" xmlns:w10="urn:schemas-microsoft-com:office:word" xmlns:w="http://schemas.openxmlformats.org/wordprocessingml/2006/main" xmlns:w14="http://schemas.microsoft.com/office/word/2010/wordml" xmlns:w15="http://schemas.microsoft.com/office/word/2012/wordml" xmlns:w16cei="http://schemas.microsoft.com/office/word/2026/wordml/cei" xmlns:w16cex="http://schemas.microsoft.com/office/word/2018/wordml/cex" xmlns:w16cid="http://schemas.microsoft.com/office/word/2016/wordml/cid" xmlns:w16="http://schemas.microsoft.com/office/word/2018/wordml" xmlns:w16du="http://schemas.microsoft.com/office/word/2023/wordml/word16du" xmlns:w16sdtdh="http://schemas.microsoft.com/office/word/2020/wordml/sdtdatahash" xmlns:w16sdtfl="http://schemas.microsoft.com/office/word/2024/wordml/sdtformatlock" xmlns:w16se="http://schemas.microsoft.com/office/word/2015/wordml/symex" xmlns:wpg="http://schemas.microsoft.com/office/word/2010/wordprocessingGroup" xmlns:wpi="http://schemas.microsoft.com/office/word/2010/wordprocessingInk" xmlns:wne="http://schemas.microsoft.com/office/word/2006/wordml" xmlns:wps="http://schemas.microsoft.com/office/word/2010/wordprocessingShape" mc:Ignorable="w14 w15 w16se w16cid w16 w16cex w16sdtdh w16sdtfl w16du wp14">
   <w:body>
     <w:p>
-      <w:r>
-        <w:t xml:space="preserve">Jobtrackr: </w:t>
+      <w:proofErr w:type="spellStart"/>
+      <w:r>
+        <w:t>Jobtrackr</w:t>
+      </w:r>
+      <w:proofErr w:type="spellEnd"/>
+      <w:r>
+        <w:t xml:space="preserve">: </w:t>
       </w:r>
       <w:hyperlink r:id="rId5" w:history="1">
+        <w:proofErr w:type="spellStart"/>
         <w:r>
           <w:rPr>
             <w:rStyle w:val="Hyperlink"/>
           </w:rPr>
           <w:t>JobTrackr</w:t>
         </w:r>
+        <w:proofErr w:type="spellEnd"/>
       </w:hyperlink>
       <w:r>
         <w:t xml:space="preserve"> | </w:t>
       </w:r>
       <w:hyperlink r:id="rId6" w:history="1">
+        <w:proofErr w:type="spellStart"/>
         <w:r>
           <w:rPr>
             <w:rStyle w:val="Hyperlink"/>
           </w:rPr>
-          <w:t>ZohaibRahim/CPSC300_GroupProject</w:t>
+          <w:t>ZohaibRahim</w:t>
         </w:r>
-      </w:hyperlink>
-      <w:r>
-        <w:t xml:space="preserve"> | </w:t>
-      </w:r>
-      <w:hyperlink r:id="rId7" w:history="1">
+        <w:proofErr w:type="spellEnd"/>
         <w:r>
           <w:rPr>
             <w:rStyle w:val="Hyperlink"/>
           </w:rPr>
-          <w:t>ZohaibRahim/Jobtrackr-main: A full-stack application with Angular frontend and Node.js/Express backend.</w:t>
+          <w:t>/CPSC300_GroupProject</w:t>
         </w:r>
       </w:hyperlink>
-    </w:p>
-    <w:p>
-      <w:hyperlink r:id="rId8" w:history="1">
+      <w:r>
+        <w:t xml:space="preserve"> | </w:t>
+      </w:r>
+      <w:hyperlink r:id="rId7" w:history="1">
+        <w:proofErr w:type="spellStart"/>
         <w:r>
           <w:rPr>
             <w:rStyle w:val="Hyperlink"/>
           </w:rPr>
-          <w:t>ZohaibRahim/PowerShell-Script-Basic</w:t>
+          <w:t>ZohaibRahim</w:t>
         </w:r>
-      </w:hyperlink>
-    </w:p>
-    <w:p>
-      <w:hyperlink r:id="rId9" w:history="1">
+        <w:proofErr w:type="spellEnd"/>
         <w:r>
           <w:rPr>
             <w:rStyle w:val="Hyperlink"/>
           </w:rPr>
-          <w:t>ZohaibRahim/Python-Security-Log-Analyzer</w:t>
+          <w:t>/</w:t>
         </w:r>
-      </w:hyperlink>
-    </w:p>
-    <w:p>
-      <w:r>
-        <w:rPr>
-          <w:b/>
-          <w:bCs/>
-        </w:rPr>
-        <w:t>J</w:t>
-      </w:r>
-      <w:r>
-        <w:rPr>
-          <w:b/>
-          <w:bCs/>
-        </w:rPr>
-        <w:t>ailbreak Prompt Detection with BERT</w:t>
-      </w:r>
-      <w:r>
-        <w:t xml:space="preserve">: </w:t>
-      </w:r>
-      <w:hyperlink r:id="rId10" w:history="1">
+        <w:proofErr w:type="spellStart"/>
         <w:r>
           <w:rPr>
             <w:rStyle w:val="Hyperlink"/>
           </w:rPr>
-          <w:t>ZohaibRahim/CPSC461_Team_Project: This is a team project for the Applied Machine Learning course at UNBC. The members of this group are: Josh Holuboch, Yamin Xu, Zohaib Rahim</w:t>
+          <w:t>Jobtrackr</w:t>
+        </w:r>
+        <w:proofErr w:type="spellEnd"/>
+        <w:r>
+          <w:rPr>
+            <w:rStyle w:val="Hyperlink"/>
+          </w:rPr>
+          <w:t>-main: A full-stack application with Angular frontend and Node.js/Express backend.</w:t>
+        </w:r>
+      </w:hyperlink>
+    </w:p>
+    <w:p>
+      <w:hyperlink r:id="rId8" w:history="1">
+        <w:proofErr w:type="spellStart"/>
+        <w:r>
+          <w:rPr>
+            <w:rStyle w:val="Hyperlink"/>
+          </w:rPr>
+          <w:t>ZohaibRahim</w:t>
+        </w:r>
+        <w:proofErr w:type="spellEnd"/>
+        <w:r>
+          <w:rPr>
+            <w:rStyle w:val="Hyperlink"/>
+          </w:rPr>
+          <w:t>/PowerShell-Script-Basic</w:t>
+        </w:r>
+      </w:hyperlink>
+    </w:p>
+    <w:p>
+      <w:hyperlink r:id="rId9" w:history="1">
+        <w:proofErr w:type="spellStart"/>
+        <w:r>
+          <w:rPr>
+            <w:rStyle w:val="Hyperlink"/>
+          </w:rPr>
+          <w:t>ZohaibRahim</w:t>
+        </w:r>
+        <w:proofErr w:type="spellEnd"/>
+        <w:r>
+          <w:rPr>
+            <w:rStyle w:val="Hyperlink"/>
+          </w:rPr>
+          <w:t>/Python-Security-Log-Analyzer</w:t>
+        </w:r>
+      </w:hyperlink>
+    </w:p>
+    <w:p>
+      <w:r>
+        <w:rPr>
+          <w:b/>
+          <w:bCs/>
+        </w:rPr>
+        <w:t>J</w:t>
+      </w:r>
+      <w:r>
+        <w:rPr>
+          <w:b/>
+          <w:bCs/>
+        </w:rPr>
+        <w:t>ailbreak Prompt Detection with BERT</w:t>
+      </w:r>
+      <w:r>
+        <w:t xml:space="preserve">: </w:t>
+      </w:r>
+      <w:hyperlink r:id="rId10" w:history="1">
+        <w:proofErr w:type="spellStart"/>
+        <w:r>
+          <w:rPr>
+            <w:rStyle w:val="Hyperlink"/>
+          </w:rPr>
+          <w:t>ZohaibRahim</w:t>
+        </w:r>
+        <w:proofErr w:type="spellEnd"/>
+        <w:r>
+          <w:rPr>
+            <w:rStyle w:val="Hyperlink"/>
+          </w:rPr>
+          <w:t>/CPSC461_Team_Project: This is a team project for the Applied Machine Learning course at UNBC. The members of this group are: Josh Holuboch, Yamin Xu, Zohaib Rahim</w:t>
         </w:r>
       </w:hyperlink>
     </w:p>
@@ -196,12 +257,21 @@
           <w:bCs/>
         </w:rPr>
       </w:pPr>
-      <w:r>
-        <w:rPr>
-          <w:b/>
-          <w:bCs/>
-        </w:rPr>
-        <w:t>TimeClass - Java Time Management Library</w:t>
+      <w:proofErr w:type="spellStart"/>
+      <w:r>
+        <w:rPr>
+          <w:b/>
+          <w:bCs/>
+        </w:rPr>
+        <w:t>TimeClass</w:t>
+      </w:r>
+      <w:proofErr w:type="spellEnd"/>
+      <w:r>
+        <w:rPr>
+          <w:b/>
+          <w:bCs/>
+        </w:rPr>
+        <w:t xml:space="preserve"> - Java Time Management Library</w:t>
       </w:r>
     </w:p>
     <w:p>
@@ -418,513 +488,23 @@
         </w:rPr>
       </w:pPr>
       <w:hyperlink r:id="rId12" w:history="1">
+        <w:proofErr w:type="spellStart"/>
         <w:r>
           <w:rPr>
             <w:rStyle w:val="Hyperlink"/>
             <w:b/>
             <w:bCs/>
           </w:rPr>
-          <w:t>ZohaibRahim/Algorithm-Analysis-and-Development: Algorithm Analysis and Development</w:t>
+          <w:t>ZohaibRahim</w:t>
         </w:r>
-      </w:hyperlink>
-      <w:r>
-        <w:rPr>
-          <w:b/>
-          <w:bCs/>
-        </w:rPr>
-        <w:br/>
-      </w:r>
-      <w:r>
-        <w:rPr>
-          <w:b/>
-          <w:bCs/>
-        </w:rPr>
-        <w:t>BigInteger Arithmetic Operations Benchmarking</w:t>
-      </w:r>
-    </w:p>
-    <w:p>
-      <w:pPr>
-        <w:rPr>
-          <w:b/>
-          <w:bCs/>
-        </w:rPr>
-      </w:pPr>
-      <w:r>
-        <w:rPr>
-          <w:b/>
-          <w:bCs/>
-        </w:rPr>
-        <w:t>This Java project evaluates the performance of arithmetic operations, specifically addition and multiplication, using the BigInteger class. The goal is to analyze the execution time of these operations as the size of the operands (in bits) increases. The project includes a detailed examination of the StopWatch class used for accurate time measurement.</w:t>
-      </w:r>
-    </w:p>
-    <w:p>
-      <w:pPr>
-        <w:rPr>
-          <w:b/>
-          <w:bCs/>
-        </w:rPr>
-      </w:pPr>
-      <w:r>
-        <w:rPr>
-          <w:b/>
-          <w:bCs/>
-        </w:rPr>
-        <w:lastRenderedPageBreak/>
-        <w:t>COMPONENT: StopWatch Class:</w:t>
-      </w:r>
-    </w:p>
-    <w:p>
-      <w:pPr>
-        <w:numPr>
-          <w:ilvl w:val="0"/>
-          <w:numId w:val="2"/>
-        </w:numPr>
-        <w:rPr>
-          <w:b/>
-          <w:bCs/>
-        </w:rPr>
-      </w:pPr>
-      <w:r>
-        <w:rPr>
-          <w:b/>
-          <w:bCs/>
-        </w:rPr>
-        <w:t>The StopWatch class provides accurate timing measurements for the benchmarking process.</w:t>
-      </w:r>
-    </w:p>
-    <w:p>
-      <w:pPr>
-        <w:numPr>
-          <w:ilvl w:val="0"/>
-          <w:numId w:val="2"/>
-        </w:numPr>
-        <w:rPr>
-          <w:b/>
-          <w:bCs/>
-        </w:rPr>
-      </w:pPr>
-      <w:r>
-        <w:rPr>
-          <w:b/>
-          <w:bCs/>
-        </w:rPr>
-        <w:t>It ensures precise measurement using System.nanoTime() for capturing short durations.</w:t>
-      </w:r>
-    </w:p>
-    <w:p>
-      <w:pPr>
-        <w:numPr>
-          <w:ilvl w:val="0"/>
-          <w:numId w:val="2"/>
-        </w:numPr>
-        <w:rPr>
-          <w:b/>
-          <w:bCs/>
-        </w:rPr>
-      </w:pPr>
-      <w:r>
-        <w:rPr>
-          <w:b/>
-          <w:bCs/>
-        </w:rPr>
-        <w:t>Methods include start(), stop(), reset(), and elapsed().</w:t>
-      </w:r>
-    </w:p>
-    <w:p>
-      <w:pPr>
-        <w:rPr>
-          <w:b/>
-          <w:bCs/>
-        </w:rPr>
-      </w:pPr>
-      <w:r>
-        <w:rPr>
-          <w:b/>
-          <w:bCs/>
-        </w:rPr>
-        <w:t>Addition Benchmark (TestAddition):</w:t>
-      </w:r>
-    </w:p>
-    <w:p>
-      <w:pPr>
-        <w:numPr>
-          <w:ilvl w:val="0"/>
-          <w:numId w:val="3"/>
-        </w:numPr>
-        <w:rPr>
-          <w:b/>
-          <w:bCs/>
-        </w:rPr>
-      </w:pPr>
-      <w:r>
-        <w:rPr>
-          <w:b/>
-          <w:bCs/>
-        </w:rPr>
-        <w:t>Measures the execution time of BigInteger addition with varying operand sizes.</w:t>
-      </w:r>
-    </w:p>
-    <w:p>
-      <w:pPr>
-        <w:numPr>
-          <w:ilvl w:val="0"/>
-          <w:numId w:val="3"/>
-        </w:numPr>
-        <w:rPr>
-          <w:b/>
-          <w:bCs/>
-        </w:rPr>
-      </w:pPr>
-      <w:r>
-        <w:rPr>
-          <w:b/>
-          <w:bCs/>
-        </w:rPr>
-        <w:t>Outputs include execution time for different bit lengths and an analysis of the observed trends.</w:t>
-      </w:r>
-    </w:p>
-    <w:p>
-      <w:pPr>
-        <w:rPr>
-          <w:b/>
-          <w:bCs/>
-        </w:rPr>
-      </w:pPr>
-      <w:r>
-        <w:rPr>
-          <w:b/>
-          <w:bCs/>
-        </w:rPr>
-        <w:t>Multiplication Benchmark (TestMultiplication):</w:t>
-      </w:r>
-    </w:p>
-    <w:p>
-      <w:pPr>
-        <w:numPr>
-          <w:ilvl w:val="0"/>
-          <w:numId w:val="4"/>
-        </w:numPr>
-        <w:rPr>
-          <w:b/>
-          <w:bCs/>
-        </w:rPr>
-      </w:pPr>
-      <w:r>
-        <w:rPr>
-          <w:b/>
-          <w:bCs/>
-        </w:rPr>
-        <w:t>Evaluates the execution time of BigInteger multiplication for different operand sizes.</w:t>
-      </w:r>
-    </w:p>
-    <w:p>
-      <w:pPr>
-        <w:numPr>
-          <w:ilvl w:val="0"/>
-          <w:numId w:val="4"/>
-        </w:numPr>
-        <w:rPr>
-          <w:b/>
-          <w:bCs/>
-        </w:rPr>
-      </w:pPr>
-      <w:r>
-        <w:rPr>
-          <w:b/>
-          <w:bCs/>
-        </w:rPr>
-        <w:t>Provides insights into the relationship between operand size and execution time.</w:t>
-      </w:r>
-    </w:p>
-    <w:p>
-      <w:pPr>
-        <w:rPr>
-          <w:b/>
-          <w:bCs/>
-        </w:rPr>
-      </w:pPr>
-      <w:r>
-        <w:rPr>
-          <w:b/>
-          <w:bCs/>
-        </w:rPr>
-        <w:t>Observations and Analysis:</w:t>
-      </w:r>
-    </w:p>
-    <w:p>
-      <w:pPr>
-        <w:numPr>
-          <w:ilvl w:val="0"/>
-          <w:numId w:val="5"/>
-        </w:numPr>
-        <w:rPr>
-          <w:b/>
-          <w:bCs/>
-        </w:rPr>
-      </w:pPr>
-      <w:r>
-        <w:rPr>
-          <w:b/>
-          <w:bCs/>
-        </w:rPr>
-        <w:t>Detailed observations on the relationship between operand size and execution time for addition and multiplication.</w:t>
-      </w:r>
-    </w:p>
-    <w:p>
-      <w:pPr>
-        <w:numPr>
-          <w:ilvl w:val="0"/>
-          <w:numId w:val="5"/>
-        </w:numPr>
-        <w:rPr>
-          <w:b/>
-          <w:bCs/>
-        </w:rPr>
-      </w:pPr>
-      <w:r>
-        <w:rPr>
-          <w:b/>
-          <w:bCs/>
-        </w:rPr>
-        <w:t>Scalability trends, including factors affecting performance for different operand sizes.</w:t>
-      </w:r>
-    </w:p>
-    <w:p>
-      <w:pPr>
-        <w:rPr>
-          <w:b/>
-          <w:bCs/>
-        </w:rPr>
-      </w:pPr>
-      <w:r>
-        <w:rPr>
-          <w:b/>
-          <w:bCs/>
-        </w:rPr>
-        <w:t>Accuracy Assurance:</w:t>
-      </w:r>
-    </w:p>
-    <w:p>
-      <w:pPr>
-        <w:numPr>
-          <w:ilvl w:val="0"/>
-          <w:numId w:val="6"/>
-        </w:numPr>
-        <w:rPr>
-          <w:b/>
-          <w:bCs/>
-        </w:rPr>
-      </w:pPr>
-      <w:r>
-        <w:rPr>
-          <w:b/>
-          <w:bCs/>
-        </w:rPr>
-        <w:t>Discussion on the accuracy of the StopWatch class and the reliability of the benchmarking methodology.</w:t>
-      </w:r>
-    </w:p>
-    <w:p>
-      <w:pPr>
-        <w:rPr>
-          <w:b/>
-          <w:bCs/>
-        </w:rPr>
-      </w:pPr>
-      <w:r>
-        <w:rPr>
-          <w:b/>
-          <w:bCs/>
-        </w:rPr>
-        <w:t>Usage:</w:t>
-      </w:r>
-    </w:p>
-    <w:p>
-      <w:pPr>
-        <w:numPr>
-          <w:ilvl w:val="0"/>
-          <w:numId w:val="7"/>
-        </w:numPr>
-        <w:rPr>
-          <w:b/>
-          <w:bCs/>
-        </w:rPr>
-      </w:pPr>
-      <w:r>
-        <w:rPr>
-          <w:b/>
-          <w:bCs/>
-        </w:rPr>
-        <w:t>Run TestAddition to benchmark addition operations.</w:t>
-      </w:r>
-    </w:p>
-    <w:p>
-      <w:pPr>
-        <w:numPr>
-          <w:ilvl w:val="0"/>
-          <w:numId w:val="7"/>
-        </w:numPr>
-        <w:rPr>
-          <w:b/>
-          <w:bCs/>
-        </w:rPr>
-      </w:pPr>
-      <w:r>
-        <w:rPr>
-          <w:b/>
-          <w:bCs/>
-        </w:rPr>
-        <w:t>Run TestMultiplication to benchmark multiplication operations.</w:t>
-      </w:r>
-    </w:p>
-    <w:p>
-      <w:pPr>
-        <w:rPr>
-          <w:b/>
-          <w:bCs/>
-        </w:rPr>
-      </w:pPr>
-      <w:r>
-        <w:rPr>
-          <w:b/>
-          <w:bCs/>
-        </w:rPr>
-        <w:t>Key Findings:</w:t>
-      </w:r>
-    </w:p>
-    <w:p>
-      <w:pPr>
-        <w:numPr>
-          <w:ilvl w:val="0"/>
-          <w:numId w:val="8"/>
-        </w:numPr>
-        <w:rPr>
-          <w:b/>
-          <w:bCs/>
-        </w:rPr>
-      </w:pPr>
-      <w:r>
-        <w:rPr>
-          <w:b/>
-          <w:bCs/>
-        </w:rPr>
-        <w:t>Both addition and multiplication operations exhibit varying execution times with increasing operand sizes.</w:t>
-      </w:r>
-    </w:p>
-    <w:p>
-      <w:pPr>
-        <w:numPr>
-          <w:ilvl w:val="0"/>
-          <w:numId w:val="8"/>
-        </w:numPr>
-        <w:rPr>
-          <w:b/>
-          <w:bCs/>
-        </w:rPr>
-      </w:pPr>
-      <w:r>
-        <w:rPr>
-          <w:b/>
-          <w:bCs/>
-        </w:rPr>
-        <w:t>Analysis of scalability trends and factors influencing performance.</w:t>
-      </w:r>
-    </w:p>
-    <w:p>
-      <w:pPr>
-        <w:numPr>
-          <w:ilvl w:val="0"/>
-          <w:numId w:val="8"/>
-        </w:numPr>
-        <w:rPr>
-          <w:b/>
-          <w:bCs/>
-        </w:rPr>
-      </w:pPr>
-      <w:r>
-        <w:rPr>
-          <w:b/>
-          <w:bCs/>
-        </w:rPr>
-        <w:t>Considerations for understanding the underlying complexities of BigInteger arithmetic operations.</w:t>
-      </w:r>
-    </w:p>
-    <w:p>
-      <w:pPr>
-        <w:rPr>
-          <w:b/>
-          <w:bCs/>
-        </w:rPr>
-      </w:pPr>
-      <w:r>
-        <w:rPr>
-          <w:b/>
-          <w:bCs/>
-        </w:rPr>
-        <w:t>Note:</w:t>
-      </w:r>
-    </w:p>
-    <w:p>
-      <w:pPr>
-        <w:numPr>
-          <w:ilvl w:val="0"/>
-          <w:numId w:val="9"/>
-        </w:numPr>
-        <w:rPr>
-          <w:b/>
-          <w:bCs/>
-        </w:rPr>
-      </w:pPr>
-      <w:r>
-        <w:rPr>
-          <w:b/>
-          <w:bCs/>
-        </w:rPr>
-        <w:t>The project provides insights into the performance characteristics of BigInteger operations under different scenarios.</w:t>
-      </w:r>
-    </w:p>
-    <w:p>
-      <w:pPr>
-        <w:numPr>
-          <w:ilvl w:val="0"/>
-          <w:numId w:val="9"/>
-        </w:numPr>
-        <w:rPr>
-          <w:b/>
-          <w:bCs/>
-        </w:rPr>
-      </w:pPr>
-      <w:r>
-        <w:rPr>
-          <w:b/>
-          <w:bCs/>
-        </w:rPr>
-        <w:lastRenderedPageBreak/>
-        <w:t>The StopWatch class ensures accurate timing measurements, contributing to reliable benchmarking results.</w:t>
-      </w:r>
-    </w:p>
-    <w:p>
-      <w:pPr>
-        <w:rPr>
-          <w:b/>
-          <w:bCs/>
-        </w:rPr>
-      </w:pPr>
-    </w:p>
-    <w:p>
-      <w:pPr>
-        <w:rPr>
-          <w:b/>
-          <w:bCs/>
-        </w:rPr>
-      </w:pPr>
-      <w:hyperlink r:id="rId13" w:history="1">
+        <w:proofErr w:type="spellEnd"/>
         <w:r>
           <w:rPr>
             <w:rStyle w:val="Hyperlink"/>
             <w:b/>
             <w:bCs/>
           </w:rPr>
-          <w:t>ZohaibRahim/Concurrent-and-Distributed-Programming</w:t>
+          <w:t>/Algorithm-Analysis-and-Development: Algorithm Analysis and Development</w:t>
         </w:r>
       </w:hyperlink>
       <w:r>
@@ -934,605 +514,1403 @@
         </w:rPr>
         <w:br/>
       </w:r>
-      <w:r>
-        <w:rPr>
-          <w:b/>
-          <w:bCs/>
-        </w:rPr>
-        <w:t>Concurrent and Distributed Programming</w:t>
-      </w:r>
-    </w:p>
-    <w:p>
-      <w:pPr>
-        <w:rPr>
-          <w:b/>
-          <w:bCs/>
-        </w:rPr>
-      </w:pPr>
-      <w:r>
-        <w:rPr>
-          <w:b/>
-          <w:bCs/>
-          <w:i/>
-          <w:iCs/>
-        </w:rPr>
-        <w:t>Content</w:t>
-      </w:r>
-    </w:p>
-    <w:p>
-      <w:pPr>
-        <w:numPr>
-          <w:ilvl w:val="0"/>
-          <w:numId w:val="10"/>
-        </w:numPr>
-        <w:rPr>
-          <w:b/>
-          <w:bCs/>
-        </w:rPr>
-      </w:pPr>
-      <w:r>
-        <w:rPr>
-          <w:b/>
-          <w:bCs/>
-        </w:rPr>
-        <w:t>Concurrent/Parallel Merge Sort</w:t>
-      </w:r>
-    </w:p>
-    <w:p>
-      <w:pPr>
-        <w:numPr>
-          <w:ilvl w:val="0"/>
-          <w:numId w:val="10"/>
-        </w:numPr>
-        <w:rPr>
-          <w:b/>
-          <w:bCs/>
-        </w:rPr>
-      </w:pPr>
-      <w:r>
-        <w:rPr>
-          <w:b/>
-          <w:bCs/>
-        </w:rPr>
-        <w:t>Custom Lock Implementation</w:t>
-      </w:r>
-    </w:p>
-    <w:p>
-      <w:pPr>
-        <w:numPr>
-          <w:ilvl w:val="0"/>
-          <w:numId w:val="10"/>
-        </w:numPr>
-        <w:rPr>
-          <w:b/>
-          <w:bCs/>
-        </w:rPr>
-      </w:pPr>
-      <w:r>
-        <w:rPr>
-          <w:b/>
-          <w:bCs/>
-        </w:rPr>
-        <w:t>Thread Management</w:t>
-      </w:r>
-    </w:p>
-    <w:p>
-      <w:pPr>
-        <w:numPr>
-          <w:ilvl w:val="0"/>
-          <w:numId w:val="10"/>
-        </w:numPr>
-        <w:rPr>
-          <w:b/>
-          <w:bCs/>
-        </w:rPr>
-      </w:pPr>
-      <w:r>
-        <w:rPr>
-          <w:b/>
-          <w:bCs/>
-        </w:rPr>
-        <w:t>Semaphore Based File Access</w:t>
-      </w:r>
-    </w:p>
-    <w:p>
-      <w:pPr>
-        <w:numPr>
-          <w:ilvl w:val="0"/>
-          <w:numId w:val="10"/>
-        </w:numPr>
-        <w:rPr>
-          <w:b/>
-          <w:bCs/>
-        </w:rPr>
-      </w:pPr>
-      <w:r>
-        <w:rPr>
-          <w:b/>
-          <w:bCs/>
-        </w:rPr>
-        <w:t>Hospital Simulation</w:t>
-      </w:r>
-    </w:p>
-    <w:p>
-      <w:pPr>
-        <w:numPr>
-          <w:ilvl w:val="0"/>
-          <w:numId w:val="10"/>
-        </w:numPr>
-        <w:rPr>
-          <w:b/>
-          <w:bCs/>
-        </w:rPr>
-      </w:pPr>
-      <w:r>
-        <w:rPr>
-          <w:b/>
-          <w:bCs/>
-        </w:rPr>
-        <w:t>Leader Election</w:t>
-      </w:r>
-    </w:p>
-    <w:p>
-      <w:pPr>
-        <w:numPr>
-          <w:ilvl w:val="1"/>
-          <w:numId w:val="10"/>
-        </w:numPr>
-        <w:rPr>
-          <w:b/>
-          <w:bCs/>
-        </w:rPr>
-      </w:pPr>
-      <w:r>
-        <w:rPr>
-          <w:b/>
-          <w:bCs/>
-        </w:rPr>
-        <w:t>Hirschberg-Sinclair (HS) algorithm</w:t>
-      </w:r>
-    </w:p>
-    <w:p>
-      <w:pPr>
-        <w:numPr>
-          <w:ilvl w:val="1"/>
-          <w:numId w:val="10"/>
-        </w:numPr>
-        <w:rPr>
-          <w:b/>
-          <w:bCs/>
-        </w:rPr>
-      </w:pPr>
-      <w:r>
-        <w:rPr>
-          <w:b/>
-          <w:bCs/>
-        </w:rPr>
-        <w:t>Leader Competing with Right (LCR) algorithm</w:t>
-      </w:r>
-    </w:p>
-    <w:p>
-      <w:pPr>
-        <w:numPr>
-          <w:ilvl w:val="0"/>
-          <w:numId w:val="10"/>
-        </w:numPr>
-        <w:rPr>
-          <w:b/>
-          <w:bCs/>
-        </w:rPr>
-      </w:pPr>
-      <w:r>
-        <w:rPr>
-          <w:b/>
-          <w:bCs/>
-        </w:rPr>
-        <w:t>NP Peterson Algorithm</w:t>
-      </w:r>
-    </w:p>
-    <w:p>
-      <w:pPr>
-        <w:numPr>
-          <w:ilvl w:val="0"/>
-          <w:numId w:val="10"/>
-        </w:numPr>
-        <w:rPr>
-          <w:b/>
-          <w:bCs/>
-        </w:rPr>
-      </w:pPr>
-      <w:r>
-        <w:rPr>
-          <w:b/>
-          <w:bCs/>
-        </w:rPr>
-        <w:t>Bakery Algorithm</w:t>
-      </w:r>
-    </w:p>
-    <w:p>
-      <w:pPr>
-        <w:rPr>
-          <w:b/>
-          <w:bCs/>
-        </w:rPr>
-      </w:pPr>
-    </w:p>
-    <w:p>
-      <w:pPr>
-        <w:rPr>
-          <w:b/>
-          <w:bCs/>
-        </w:rPr>
-      </w:pPr>
-      <w:hyperlink r:id="rId14" w:history="1">
+      <w:proofErr w:type="spellStart"/>
+      <w:r>
+        <w:rPr>
+          <w:b/>
+          <w:bCs/>
+        </w:rPr>
+        <w:t>BigInteger</w:t>
+      </w:r>
+      <w:proofErr w:type="spellEnd"/>
+      <w:r>
+        <w:rPr>
+          <w:b/>
+          <w:bCs/>
+        </w:rPr>
+        <w:t xml:space="preserve"> Arithmetic Operations Benchmarking</w:t>
+      </w:r>
+    </w:p>
+    <w:p>
+      <w:pPr>
+        <w:rPr>
+          <w:b/>
+          <w:bCs/>
+        </w:rPr>
+      </w:pPr>
+      <w:r>
+        <w:rPr>
+          <w:b/>
+          <w:bCs/>
+        </w:rPr>
+        <w:t xml:space="preserve">This Java project evaluates the performance of arithmetic operations, specifically addition and multiplication, using the </w:t>
+      </w:r>
+      <w:proofErr w:type="spellStart"/>
+      <w:r>
+        <w:rPr>
+          <w:b/>
+          <w:bCs/>
+        </w:rPr>
+        <w:t>BigInteger</w:t>
+      </w:r>
+      <w:proofErr w:type="spellEnd"/>
+      <w:r>
+        <w:rPr>
+          <w:b/>
+          <w:bCs/>
+        </w:rPr>
+        <w:t xml:space="preserve"> class. The goal is to analyze the execution time of these operations as the size of the operands (in bits) increases. The project includes a detailed examination of the </w:t>
+      </w:r>
+      <w:proofErr w:type="spellStart"/>
+      <w:r>
+        <w:rPr>
+          <w:b/>
+          <w:bCs/>
+        </w:rPr>
+        <w:t>StopWatch</w:t>
+      </w:r>
+      <w:proofErr w:type="spellEnd"/>
+      <w:r>
+        <w:rPr>
+          <w:b/>
+          <w:bCs/>
+        </w:rPr>
+        <w:t xml:space="preserve"> class used for accurate time measurement.</w:t>
+      </w:r>
+    </w:p>
+    <w:p>
+      <w:pPr>
+        <w:rPr>
+          <w:b/>
+          <w:bCs/>
+        </w:rPr>
+      </w:pPr>
+      <w:r>
+        <w:rPr>
+          <w:b/>
+          <w:bCs/>
+        </w:rPr>
+        <w:lastRenderedPageBreak/>
+        <w:t>COMPONENT: </w:t>
+      </w:r>
+      <w:proofErr w:type="spellStart"/>
+      <w:r>
+        <w:rPr>
+          <w:b/>
+          <w:bCs/>
+        </w:rPr>
+        <w:t>StopWatch</w:t>
+      </w:r>
+      <w:proofErr w:type="spellEnd"/>
+      <w:r>
+        <w:rPr>
+          <w:b/>
+          <w:bCs/>
+        </w:rPr>
+        <w:t xml:space="preserve"> Class:</w:t>
+      </w:r>
+    </w:p>
+    <w:p>
+      <w:pPr>
+        <w:numPr>
+          <w:ilvl w:val="0"/>
+          <w:numId w:val="2"/>
+        </w:numPr>
+        <w:rPr>
+          <w:b/>
+          <w:bCs/>
+        </w:rPr>
+      </w:pPr>
+      <w:r>
+        <w:rPr>
+          <w:b/>
+          <w:bCs/>
+        </w:rPr>
+        <w:t xml:space="preserve">The </w:t>
+      </w:r>
+      <w:proofErr w:type="spellStart"/>
+      <w:r>
+        <w:rPr>
+          <w:b/>
+          <w:bCs/>
+        </w:rPr>
+        <w:t>StopWatch</w:t>
+      </w:r>
+      <w:proofErr w:type="spellEnd"/>
+      <w:r>
+        <w:rPr>
+          <w:b/>
+          <w:bCs/>
+        </w:rPr>
+        <w:t xml:space="preserve"> class provides accurate timing measurements for the benchmarking process.</w:t>
+      </w:r>
+    </w:p>
+    <w:p>
+      <w:pPr>
+        <w:numPr>
+          <w:ilvl w:val="0"/>
+          <w:numId w:val="2"/>
+        </w:numPr>
+        <w:rPr>
+          <w:b/>
+          <w:bCs/>
+        </w:rPr>
+      </w:pPr>
+      <w:r>
+        <w:rPr>
+          <w:b/>
+          <w:bCs/>
+        </w:rPr>
+        <w:t xml:space="preserve">It ensures precise measurement using </w:t>
+      </w:r>
+      <w:proofErr w:type="spellStart"/>
+      <w:r>
+        <w:rPr>
+          <w:b/>
+          <w:bCs/>
+        </w:rPr>
+        <w:t>System.nanoTime</w:t>
+      </w:r>
+      <w:proofErr w:type="spellEnd"/>
+      <w:r>
+        <w:rPr>
+          <w:b/>
+          <w:bCs/>
+        </w:rPr>
+        <w:t>() for capturing short durations.</w:t>
+      </w:r>
+    </w:p>
+    <w:p>
+      <w:pPr>
+        <w:numPr>
+          <w:ilvl w:val="0"/>
+          <w:numId w:val="2"/>
+        </w:numPr>
+        <w:rPr>
+          <w:b/>
+          <w:bCs/>
+        </w:rPr>
+      </w:pPr>
+      <w:r>
+        <w:rPr>
+          <w:b/>
+          <w:bCs/>
+        </w:rPr>
+        <w:t>Methods include start(), stop(), reset(), and elapsed().</w:t>
+      </w:r>
+    </w:p>
+    <w:p>
+      <w:pPr>
+        <w:rPr>
+          <w:b/>
+          <w:bCs/>
+        </w:rPr>
+      </w:pPr>
+      <w:r>
+        <w:rPr>
+          <w:b/>
+          <w:bCs/>
+        </w:rPr>
+        <w:t>Addition Benchmark (</w:t>
+      </w:r>
+      <w:proofErr w:type="spellStart"/>
+      <w:r>
+        <w:rPr>
+          <w:b/>
+          <w:bCs/>
+        </w:rPr>
+        <w:t>TestAddition</w:t>
+      </w:r>
+      <w:proofErr w:type="spellEnd"/>
+      <w:r>
+        <w:rPr>
+          <w:b/>
+          <w:bCs/>
+        </w:rPr>
+        <w:t>):</w:t>
+      </w:r>
+    </w:p>
+    <w:p>
+      <w:pPr>
+        <w:numPr>
+          <w:ilvl w:val="0"/>
+          <w:numId w:val="3"/>
+        </w:numPr>
+        <w:rPr>
+          <w:b/>
+          <w:bCs/>
+        </w:rPr>
+      </w:pPr>
+      <w:r>
+        <w:rPr>
+          <w:b/>
+          <w:bCs/>
+        </w:rPr>
+        <w:t xml:space="preserve">Measures the execution time of </w:t>
+      </w:r>
+      <w:proofErr w:type="spellStart"/>
+      <w:r>
+        <w:rPr>
+          <w:b/>
+          <w:bCs/>
+        </w:rPr>
+        <w:t>BigInteger</w:t>
+      </w:r>
+      <w:proofErr w:type="spellEnd"/>
+      <w:r>
+        <w:rPr>
+          <w:b/>
+          <w:bCs/>
+        </w:rPr>
+        <w:t xml:space="preserve"> addition with varying operand sizes.</w:t>
+      </w:r>
+    </w:p>
+    <w:p>
+      <w:pPr>
+        <w:numPr>
+          <w:ilvl w:val="0"/>
+          <w:numId w:val="3"/>
+        </w:numPr>
+        <w:rPr>
+          <w:b/>
+          <w:bCs/>
+        </w:rPr>
+      </w:pPr>
+      <w:r>
+        <w:rPr>
+          <w:b/>
+          <w:bCs/>
+        </w:rPr>
+        <w:t>Outputs include execution time for different bit lengths and an analysis of the observed trends.</w:t>
+      </w:r>
+    </w:p>
+    <w:p>
+      <w:pPr>
+        <w:rPr>
+          <w:b/>
+          <w:bCs/>
+        </w:rPr>
+      </w:pPr>
+      <w:r>
+        <w:rPr>
+          <w:b/>
+          <w:bCs/>
+        </w:rPr>
+        <w:t>Multiplication Benchmark (</w:t>
+      </w:r>
+      <w:proofErr w:type="spellStart"/>
+      <w:r>
+        <w:rPr>
+          <w:b/>
+          <w:bCs/>
+        </w:rPr>
+        <w:t>TestMultiplication</w:t>
+      </w:r>
+      <w:proofErr w:type="spellEnd"/>
+      <w:r>
+        <w:rPr>
+          <w:b/>
+          <w:bCs/>
+        </w:rPr>
+        <w:t>):</w:t>
+      </w:r>
+    </w:p>
+    <w:p>
+      <w:pPr>
+        <w:numPr>
+          <w:ilvl w:val="0"/>
+          <w:numId w:val="4"/>
+        </w:numPr>
+        <w:rPr>
+          <w:b/>
+          <w:bCs/>
+        </w:rPr>
+      </w:pPr>
+      <w:r>
+        <w:rPr>
+          <w:b/>
+          <w:bCs/>
+        </w:rPr>
+        <w:t xml:space="preserve">Evaluates the execution time of </w:t>
+      </w:r>
+      <w:proofErr w:type="spellStart"/>
+      <w:r>
+        <w:rPr>
+          <w:b/>
+          <w:bCs/>
+        </w:rPr>
+        <w:t>BigInteger</w:t>
+      </w:r>
+      <w:proofErr w:type="spellEnd"/>
+      <w:r>
+        <w:rPr>
+          <w:b/>
+          <w:bCs/>
+        </w:rPr>
+        <w:t xml:space="preserve"> multiplication for different operand sizes.</w:t>
+      </w:r>
+    </w:p>
+    <w:p>
+      <w:pPr>
+        <w:numPr>
+          <w:ilvl w:val="0"/>
+          <w:numId w:val="4"/>
+        </w:numPr>
+        <w:rPr>
+          <w:b/>
+          <w:bCs/>
+        </w:rPr>
+      </w:pPr>
+      <w:r>
+        <w:rPr>
+          <w:b/>
+          <w:bCs/>
+        </w:rPr>
+        <w:t>Provides insights into the relationship between operand size and execution time.</w:t>
+      </w:r>
+    </w:p>
+    <w:p>
+      <w:pPr>
+        <w:rPr>
+          <w:b/>
+          <w:bCs/>
+        </w:rPr>
+      </w:pPr>
+      <w:r>
+        <w:rPr>
+          <w:b/>
+          <w:bCs/>
+        </w:rPr>
+        <w:t>Observations and Analysis:</w:t>
+      </w:r>
+    </w:p>
+    <w:p>
+      <w:pPr>
+        <w:numPr>
+          <w:ilvl w:val="0"/>
+          <w:numId w:val="5"/>
+        </w:numPr>
+        <w:rPr>
+          <w:b/>
+          <w:bCs/>
+        </w:rPr>
+      </w:pPr>
+      <w:r>
+        <w:rPr>
+          <w:b/>
+          <w:bCs/>
+        </w:rPr>
+        <w:t>Detailed observations on the relationship between operand size and execution time for addition and multiplication.</w:t>
+      </w:r>
+    </w:p>
+    <w:p>
+      <w:pPr>
+        <w:numPr>
+          <w:ilvl w:val="0"/>
+          <w:numId w:val="5"/>
+        </w:numPr>
+        <w:rPr>
+          <w:b/>
+          <w:bCs/>
+        </w:rPr>
+      </w:pPr>
+      <w:r>
+        <w:rPr>
+          <w:b/>
+          <w:bCs/>
+        </w:rPr>
+        <w:t>Scalability trends, including factors affecting performance for different operand sizes.</w:t>
+      </w:r>
+    </w:p>
+    <w:p>
+      <w:pPr>
+        <w:rPr>
+          <w:b/>
+          <w:bCs/>
+        </w:rPr>
+      </w:pPr>
+      <w:r>
+        <w:rPr>
+          <w:b/>
+          <w:bCs/>
+        </w:rPr>
+        <w:t>Accuracy Assurance:</w:t>
+      </w:r>
+    </w:p>
+    <w:p>
+      <w:pPr>
+        <w:numPr>
+          <w:ilvl w:val="0"/>
+          <w:numId w:val="6"/>
+        </w:numPr>
+        <w:rPr>
+          <w:b/>
+          <w:bCs/>
+        </w:rPr>
+      </w:pPr>
+      <w:r>
+        <w:rPr>
+          <w:b/>
+          <w:bCs/>
+        </w:rPr>
+        <w:t xml:space="preserve">Discussion on the accuracy of the </w:t>
+      </w:r>
+      <w:proofErr w:type="spellStart"/>
+      <w:r>
+        <w:rPr>
+          <w:b/>
+          <w:bCs/>
+        </w:rPr>
+        <w:t>StopWatch</w:t>
+      </w:r>
+      <w:proofErr w:type="spellEnd"/>
+      <w:r>
+        <w:rPr>
+          <w:b/>
+          <w:bCs/>
+        </w:rPr>
+        <w:t xml:space="preserve"> class and the reliability of the benchmarking methodology.</w:t>
+      </w:r>
+    </w:p>
+    <w:p>
+      <w:pPr>
+        <w:rPr>
+          <w:b/>
+          <w:bCs/>
+        </w:rPr>
+      </w:pPr>
+      <w:r>
+        <w:rPr>
+          <w:b/>
+          <w:bCs/>
+        </w:rPr>
+        <w:t>Usage:</w:t>
+      </w:r>
+    </w:p>
+    <w:p>
+      <w:pPr>
+        <w:numPr>
+          <w:ilvl w:val="0"/>
+          <w:numId w:val="7"/>
+        </w:numPr>
+        <w:rPr>
+          <w:b/>
+          <w:bCs/>
+        </w:rPr>
+      </w:pPr>
+      <w:r>
+        <w:rPr>
+          <w:b/>
+          <w:bCs/>
+        </w:rPr>
+        <w:t xml:space="preserve">Run </w:t>
+      </w:r>
+      <w:proofErr w:type="spellStart"/>
+      <w:r>
+        <w:rPr>
+          <w:b/>
+          <w:bCs/>
+        </w:rPr>
+        <w:t>TestAddition</w:t>
+      </w:r>
+      <w:proofErr w:type="spellEnd"/>
+      <w:r>
+        <w:rPr>
+          <w:b/>
+          <w:bCs/>
+        </w:rPr>
+        <w:t xml:space="preserve"> to benchmark addition operations.</w:t>
+      </w:r>
+    </w:p>
+    <w:p>
+      <w:pPr>
+        <w:numPr>
+          <w:ilvl w:val="0"/>
+          <w:numId w:val="7"/>
+        </w:numPr>
+        <w:rPr>
+          <w:b/>
+          <w:bCs/>
+        </w:rPr>
+      </w:pPr>
+      <w:r>
+        <w:rPr>
+          <w:b/>
+          <w:bCs/>
+        </w:rPr>
+        <w:t xml:space="preserve">Run </w:t>
+      </w:r>
+      <w:proofErr w:type="spellStart"/>
+      <w:r>
+        <w:rPr>
+          <w:b/>
+          <w:bCs/>
+        </w:rPr>
+        <w:t>TestMultiplication</w:t>
+      </w:r>
+      <w:proofErr w:type="spellEnd"/>
+      <w:r>
+        <w:rPr>
+          <w:b/>
+          <w:bCs/>
+        </w:rPr>
+        <w:t xml:space="preserve"> to benchmark multiplication operations.</w:t>
+      </w:r>
+    </w:p>
+    <w:p>
+      <w:pPr>
+        <w:rPr>
+          <w:b/>
+          <w:bCs/>
+        </w:rPr>
+      </w:pPr>
+      <w:r>
+        <w:rPr>
+          <w:b/>
+          <w:bCs/>
+        </w:rPr>
+        <w:t>Key Findings:</w:t>
+      </w:r>
+    </w:p>
+    <w:p>
+      <w:pPr>
+        <w:numPr>
+          <w:ilvl w:val="0"/>
+          <w:numId w:val="8"/>
+        </w:numPr>
+        <w:rPr>
+          <w:b/>
+          <w:bCs/>
+        </w:rPr>
+      </w:pPr>
+      <w:r>
+        <w:rPr>
+          <w:b/>
+          <w:bCs/>
+        </w:rPr>
+        <w:t>Both addition and multiplication operations exhibit varying execution times with increasing operand sizes.</w:t>
+      </w:r>
+    </w:p>
+    <w:p>
+      <w:pPr>
+        <w:numPr>
+          <w:ilvl w:val="0"/>
+          <w:numId w:val="8"/>
+        </w:numPr>
+        <w:rPr>
+          <w:b/>
+          <w:bCs/>
+        </w:rPr>
+      </w:pPr>
+      <w:r>
+        <w:rPr>
+          <w:b/>
+          <w:bCs/>
+        </w:rPr>
+        <w:t>Analysis of scalability trends and factors influencing performance.</w:t>
+      </w:r>
+    </w:p>
+    <w:p>
+      <w:pPr>
+        <w:numPr>
+          <w:ilvl w:val="0"/>
+          <w:numId w:val="8"/>
+        </w:numPr>
+        <w:rPr>
+          <w:b/>
+          <w:bCs/>
+        </w:rPr>
+      </w:pPr>
+      <w:r>
+        <w:rPr>
+          <w:b/>
+          <w:bCs/>
+        </w:rPr>
+        <w:t xml:space="preserve">Considerations for understanding the underlying complexities of </w:t>
+      </w:r>
+      <w:proofErr w:type="spellStart"/>
+      <w:r>
+        <w:rPr>
+          <w:b/>
+          <w:bCs/>
+        </w:rPr>
+        <w:t>BigInteger</w:t>
+      </w:r>
+      <w:proofErr w:type="spellEnd"/>
+      <w:r>
+        <w:rPr>
+          <w:b/>
+          <w:bCs/>
+        </w:rPr>
+        <w:t xml:space="preserve"> arithmetic operations.</w:t>
+      </w:r>
+    </w:p>
+    <w:p>
+      <w:pPr>
+        <w:rPr>
+          <w:b/>
+          <w:bCs/>
+        </w:rPr>
+      </w:pPr>
+      <w:r>
+        <w:rPr>
+          <w:b/>
+          <w:bCs/>
+        </w:rPr>
+        <w:t>Note:</w:t>
+      </w:r>
+    </w:p>
+    <w:p>
+      <w:pPr>
+        <w:numPr>
+          <w:ilvl w:val="0"/>
+          <w:numId w:val="9"/>
+        </w:numPr>
+        <w:rPr>
+          <w:b/>
+          <w:bCs/>
+        </w:rPr>
+      </w:pPr>
+      <w:r>
+        <w:rPr>
+          <w:b/>
+          <w:bCs/>
+        </w:rPr>
+        <w:t xml:space="preserve">The project provides insights into the performance characteristics of </w:t>
+      </w:r>
+      <w:proofErr w:type="spellStart"/>
+      <w:r>
+        <w:rPr>
+          <w:b/>
+          <w:bCs/>
+        </w:rPr>
+        <w:t>BigInteger</w:t>
+      </w:r>
+      <w:proofErr w:type="spellEnd"/>
+      <w:r>
+        <w:rPr>
+          <w:b/>
+          <w:bCs/>
+        </w:rPr>
+        <w:t xml:space="preserve"> operations under different scenarios.</w:t>
+      </w:r>
+    </w:p>
+    <w:p>
+      <w:pPr>
+        <w:numPr>
+          <w:ilvl w:val="0"/>
+          <w:numId w:val="9"/>
+        </w:numPr>
+        <w:rPr>
+          <w:b/>
+          <w:bCs/>
+        </w:rPr>
+      </w:pPr>
+      <w:r>
+        <w:rPr>
+          <w:b/>
+          <w:bCs/>
+        </w:rPr>
+        <w:lastRenderedPageBreak/>
+        <w:t xml:space="preserve">The </w:t>
+      </w:r>
+      <w:proofErr w:type="spellStart"/>
+      <w:r>
+        <w:rPr>
+          <w:b/>
+          <w:bCs/>
+        </w:rPr>
+        <w:t>StopWatch</w:t>
+      </w:r>
+      <w:proofErr w:type="spellEnd"/>
+      <w:r>
+        <w:rPr>
+          <w:b/>
+          <w:bCs/>
+        </w:rPr>
+        <w:t xml:space="preserve"> class ensures accurate timing measurements, contributing to reliable benchmarking results.</w:t>
+      </w:r>
+    </w:p>
+    <w:p>
+      <w:pPr>
+        <w:rPr>
+          <w:b/>
+          <w:bCs/>
+        </w:rPr>
+      </w:pPr>
+    </w:p>
+    <w:p>
+      <w:pPr>
+        <w:rPr>
+          <w:b/>
+          <w:bCs/>
+        </w:rPr>
+      </w:pPr>
+      <w:hyperlink r:id="rId13" w:history="1">
+        <w:proofErr w:type="spellStart"/>
         <w:r>
           <w:rPr>
             <w:rStyle w:val="Hyperlink"/>
             <w:b/>
             <w:bCs/>
           </w:rPr>
-          <w:t>ZohaibRahim/Data-Structures: Data Structures</w:t>
+          <w:t>ZohaibRahim</w:t>
         </w:r>
-      </w:hyperlink>
-      <w:r>
-        <w:rPr>
-          <w:b/>
-          <w:bCs/>
-        </w:rPr>
-        <w:br/>
-      </w:r>
-      <w:r>
-        <w:rPr>
-          <w:b/>
-          <w:bCs/>
-        </w:rPr>
-        <w:t>Data Structures</w:t>
-      </w:r>
-    </w:p>
-    <w:p>
-      <w:pPr>
-        <w:rPr>
-          <w:b/>
-          <w:bCs/>
-        </w:rPr>
-      </w:pPr>
-      <w:r>
-        <w:rPr>
-          <w:b/>
-          <w:bCs/>
-        </w:rPr>
-        <w:t>Topics</w:t>
-      </w:r>
-    </w:p>
-    <w:p>
-      <w:pPr>
-        <w:numPr>
-          <w:ilvl w:val="0"/>
-          <w:numId w:val="11"/>
-        </w:numPr>
-        <w:rPr>
-          <w:b/>
-          <w:bCs/>
-        </w:rPr>
-      </w:pPr>
-      <w:r>
-        <w:rPr>
-          <w:b/>
-          <w:bCs/>
-        </w:rPr>
-        <w:t>Removing Duplicates</w:t>
-      </w:r>
-    </w:p>
-    <w:p>
-      <w:pPr>
-        <w:numPr>
-          <w:ilvl w:val="0"/>
-          <w:numId w:val="11"/>
-        </w:numPr>
-        <w:rPr>
-          <w:b/>
-          <w:bCs/>
-        </w:rPr>
-      </w:pPr>
-      <w:r>
-        <w:rPr>
-          <w:b/>
-          <w:bCs/>
-        </w:rPr>
-        <w:t>Execution Time Testing</w:t>
-      </w:r>
-    </w:p>
-    <w:p>
-      <w:pPr>
-        <w:numPr>
-          <w:ilvl w:val="1"/>
-          <w:numId w:val="11"/>
-        </w:numPr>
-        <w:rPr>
-          <w:b/>
-          <w:bCs/>
-        </w:rPr>
-      </w:pPr>
-      <w:r>
-        <w:rPr>
-          <w:b/>
-          <w:bCs/>
-        </w:rPr>
-        <w:t>Row-Wise mapping</w:t>
-      </w:r>
-    </w:p>
-    <w:p>
-      <w:pPr>
-        <w:numPr>
-          <w:ilvl w:val="1"/>
-          <w:numId w:val="11"/>
-        </w:numPr>
-        <w:rPr>
-          <w:b/>
-          <w:bCs/>
-        </w:rPr>
-      </w:pPr>
-      <w:r>
-        <w:rPr>
-          <w:b/>
-          <w:bCs/>
-        </w:rPr>
-        <w:t>Column-Wise mapping</w:t>
-      </w:r>
-    </w:p>
-    <w:p>
-      <w:pPr>
-        <w:numPr>
-          <w:ilvl w:val="0"/>
-          <w:numId w:val="11"/>
-        </w:numPr>
-        <w:rPr>
-          <w:b/>
-          <w:bCs/>
-        </w:rPr>
-      </w:pPr>
-      <w:r>
-        <w:rPr>
-          <w:b/>
-          <w:bCs/>
-        </w:rPr>
-        <w:t>Josephus Problem - Circular Linked List</w:t>
-      </w:r>
-    </w:p>
-    <w:p>
-      <w:pPr>
-        <w:numPr>
-          <w:ilvl w:val="0"/>
-          <w:numId w:val="11"/>
-        </w:numPr>
-        <w:rPr>
-          <w:b/>
-          <w:bCs/>
-        </w:rPr>
-      </w:pPr>
-      <w:r>
-        <w:rPr>
-          <w:b/>
-          <w:bCs/>
-        </w:rPr>
-        <w:t>Cuckoo Hashmap</w:t>
-      </w:r>
-    </w:p>
-    <w:p>
-      <w:pPr>
-        <w:numPr>
-          <w:ilvl w:val="0"/>
-          <w:numId w:val="11"/>
-        </w:numPr>
-        <w:rPr>
-          <w:b/>
-          <w:bCs/>
-        </w:rPr>
-      </w:pPr>
-      <w:r>
-        <w:rPr>
-          <w:b/>
-          <w:bCs/>
-        </w:rPr>
-        <w:t>Postfix Expression Evaluation &amp; Infix-to-Postfix Conversion</w:t>
-      </w:r>
-    </w:p>
-    <w:p>
-      <w:pPr>
-        <w:numPr>
-          <w:ilvl w:val="0"/>
-          <w:numId w:val="11"/>
-        </w:numPr>
-        <w:rPr>
-          <w:b/>
-          <w:bCs/>
-        </w:rPr>
-      </w:pPr>
-      <w:r>
-        <w:rPr>
-          <w:b/>
-          <w:bCs/>
-        </w:rPr>
-        <w:t>Merging Singly Linked Lists into a Doubly Linked List</w:t>
-      </w:r>
-    </w:p>
-    <w:p>
-      <w:pPr>
-        <w:numPr>
-          <w:ilvl w:val="0"/>
-          <w:numId w:val="11"/>
-        </w:numPr>
-        <w:rPr>
-          <w:b/>
-          <w:bCs/>
-        </w:rPr>
-      </w:pPr>
-      <w:r>
-        <w:rPr>
-          <w:b/>
-          <w:bCs/>
-        </w:rPr>
-        <w:t>Deque Implementation</w:t>
-      </w:r>
-    </w:p>
-    <w:p>
-      <w:pPr>
-        <w:numPr>
-          <w:ilvl w:val="1"/>
-          <w:numId w:val="11"/>
-        </w:numPr>
-        <w:rPr>
-          <w:b/>
-          <w:bCs/>
-        </w:rPr>
-      </w:pPr>
-      <w:r>
-        <w:rPr>
-          <w:b/>
-          <w:bCs/>
-        </w:rPr>
-        <w:t>Array</w:t>
-      </w:r>
-    </w:p>
-    <w:p>
-      <w:pPr>
-        <w:numPr>
-          <w:ilvl w:val="1"/>
-          <w:numId w:val="11"/>
-        </w:numPr>
-        <w:rPr>
-          <w:b/>
-          <w:bCs/>
-        </w:rPr>
-      </w:pPr>
-      <w:r>
-        <w:rPr>
-          <w:b/>
-          <w:bCs/>
-        </w:rPr>
-        <w:lastRenderedPageBreak/>
-        <w:t>Doubly Linked List</w:t>
-      </w:r>
-    </w:p>
-    <w:p>
-      <w:pPr>
-        <w:numPr>
-          <w:ilvl w:val="0"/>
-          <w:numId w:val="11"/>
-        </w:numPr>
-        <w:rPr>
-          <w:b/>
-          <w:bCs/>
-        </w:rPr>
-      </w:pPr>
-      <w:r>
-        <w:rPr>
-          <w:b/>
-          <w:bCs/>
-        </w:rPr>
-        <w:t>Arithmetic Expression Processing</w:t>
-      </w:r>
-    </w:p>
-    <w:p>
-      <w:pPr>
-        <w:numPr>
-          <w:ilvl w:val="1"/>
-          <w:numId w:val="11"/>
-        </w:numPr>
-        <w:rPr>
-          <w:b/>
-          <w:bCs/>
-        </w:rPr>
-      </w:pPr>
-      <w:r>
-        <w:rPr>
-          <w:b/>
-          <w:bCs/>
-        </w:rPr>
-        <w:t>Infix to Binary</w:t>
-      </w:r>
-    </w:p>
-    <w:p>
-      <w:pPr>
-        <w:numPr>
-          <w:ilvl w:val="1"/>
-          <w:numId w:val="11"/>
-        </w:numPr>
-        <w:rPr>
-          <w:b/>
-          <w:bCs/>
-        </w:rPr>
-      </w:pPr>
-      <w:r>
-        <w:rPr>
-          <w:b/>
-          <w:bCs/>
-        </w:rPr>
-        <w:t>Tree Traversal</w:t>
-      </w:r>
-    </w:p>
-    <w:p>
-      <w:pPr>
-        <w:numPr>
-          <w:ilvl w:val="0"/>
-          <w:numId w:val="11"/>
-        </w:numPr>
-        <w:rPr>
-          <w:b/>
-          <w:bCs/>
-        </w:rPr>
-      </w:pPr>
-      <w:r>
-        <w:rPr>
-          <w:b/>
-          <w:bCs/>
-        </w:rPr>
-        <w:t>Huffman Coding</w:t>
-      </w:r>
-    </w:p>
-    <w:p>
-      <w:pPr>
-        <w:rPr>
-          <w:b/>
-          <w:bCs/>
-        </w:rPr>
-      </w:pPr>
-    </w:p>
-    <w:p>
-      <w:pPr>
-        <w:rPr>
-          <w:b/>
-          <w:bCs/>
-        </w:rPr>
-      </w:pPr>
-      <w:hyperlink r:id="rId15" w:history="1">
+        <w:proofErr w:type="spellEnd"/>
         <w:r>
           <w:rPr>
             <w:rStyle w:val="Hyperlink"/>
             <w:b/>
             <w:bCs/>
           </w:rPr>
-          <w:t>ZohaibRahim/Credit-Card-Fraud-Detection</w:t>
+          <w:t>/Concurrent-and-Distributed-Programming</w:t>
         </w:r>
       </w:hyperlink>
-    </w:p>
-    <w:p>
-      <w:pPr>
-        <w:rPr>
-          <w:b/>
-          <w:bCs/>
-        </w:rPr>
-      </w:pPr>
-    </w:p>
-    <w:p>
-      <w:hyperlink r:id="rId16" w:history="1">
+      <w:r>
+        <w:rPr>
+          <w:b/>
+          <w:bCs/>
+        </w:rPr>
+        <w:br/>
+      </w:r>
+      <w:r>
+        <w:rPr>
+          <w:b/>
+          <w:bCs/>
+        </w:rPr>
+        <w:t>Concurrent and Distributed Programming</w:t>
+      </w:r>
+    </w:p>
+    <w:p>
+      <w:pPr>
+        <w:rPr>
+          <w:b/>
+          <w:bCs/>
+        </w:rPr>
+      </w:pPr>
+      <w:r>
+        <w:rPr>
+          <w:b/>
+          <w:bCs/>
+          <w:i/>
+          <w:iCs/>
+        </w:rPr>
+        <w:t>Content</w:t>
+      </w:r>
+    </w:p>
+    <w:p>
+      <w:pPr>
+        <w:numPr>
+          <w:ilvl w:val="0"/>
+          <w:numId w:val="10"/>
+        </w:numPr>
+        <w:rPr>
+          <w:b/>
+          <w:bCs/>
+        </w:rPr>
+      </w:pPr>
+      <w:r>
+        <w:rPr>
+          <w:b/>
+          <w:bCs/>
+        </w:rPr>
+        <w:t>Concurrent/Parallel Merge Sort</w:t>
+      </w:r>
+    </w:p>
+    <w:p>
+      <w:pPr>
+        <w:numPr>
+          <w:ilvl w:val="0"/>
+          <w:numId w:val="10"/>
+        </w:numPr>
+        <w:rPr>
+          <w:b/>
+          <w:bCs/>
+        </w:rPr>
+      </w:pPr>
+      <w:r>
+        <w:rPr>
+          <w:b/>
+          <w:bCs/>
+        </w:rPr>
+        <w:t>Custom Lock Implementation</w:t>
+      </w:r>
+    </w:p>
+    <w:p>
+      <w:pPr>
+        <w:numPr>
+          <w:ilvl w:val="0"/>
+          <w:numId w:val="10"/>
+        </w:numPr>
+        <w:rPr>
+          <w:b/>
+          <w:bCs/>
+        </w:rPr>
+      </w:pPr>
+      <w:r>
+        <w:rPr>
+          <w:b/>
+          <w:bCs/>
+        </w:rPr>
+        <w:t>Thread Management</w:t>
+      </w:r>
+    </w:p>
+    <w:p>
+      <w:pPr>
+        <w:numPr>
+          <w:ilvl w:val="0"/>
+          <w:numId w:val="10"/>
+        </w:numPr>
+        <w:rPr>
+          <w:b/>
+          <w:bCs/>
+        </w:rPr>
+      </w:pPr>
+      <w:r>
+        <w:rPr>
+          <w:b/>
+          <w:bCs/>
+        </w:rPr>
+        <w:t>Semaphore Based File Access</w:t>
+      </w:r>
+    </w:p>
+    <w:p>
+      <w:pPr>
+        <w:numPr>
+          <w:ilvl w:val="0"/>
+          <w:numId w:val="10"/>
+        </w:numPr>
+        <w:rPr>
+          <w:b/>
+          <w:bCs/>
+        </w:rPr>
+      </w:pPr>
+      <w:r>
+        <w:rPr>
+          <w:b/>
+          <w:bCs/>
+        </w:rPr>
+        <w:t>Hospital Simulation</w:t>
+      </w:r>
+    </w:p>
+    <w:p>
+      <w:pPr>
+        <w:numPr>
+          <w:ilvl w:val="0"/>
+          <w:numId w:val="10"/>
+        </w:numPr>
+        <w:rPr>
+          <w:b/>
+          <w:bCs/>
+        </w:rPr>
+      </w:pPr>
+      <w:r>
+        <w:rPr>
+          <w:b/>
+          <w:bCs/>
+        </w:rPr>
+        <w:t>Leader Election</w:t>
+      </w:r>
+    </w:p>
+    <w:p>
+      <w:pPr>
+        <w:numPr>
+          <w:ilvl w:val="1"/>
+          <w:numId w:val="10"/>
+        </w:numPr>
+        <w:rPr>
+          <w:b/>
+          <w:bCs/>
+        </w:rPr>
+      </w:pPr>
+      <w:r>
+        <w:rPr>
+          <w:b/>
+          <w:bCs/>
+        </w:rPr>
+        <w:t>Hirschberg-Sinclair (HS) algorithm</w:t>
+      </w:r>
+    </w:p>
+    <w:p>
+      <w:pPr>
+        <w:numPr>
+          <w:ilvl w:val="1"/>
+          <w:numId w:val="10"/>
+        </w:numPr>
+        <w:rPr>
+          <w:b/>
+          <w:bCs/>
+        </w:rPr>
+      </w:pPr>
+      <w:r>
+        <w:rPr>
+          <w:b/>
+          <w:bCs/>
+        </w:rPr>
+        <w:t>Leader Competing with Right (LCR) algorithm</w:t>
+      </w:r>
+    </w:p>
+    <w:p>
+      <w:pPr>
+        <w:numPr>
+          <w:ilvl w:val="0"/>
+          <w:numId w:val="10"/>
+        </w:numPr>
+        <w:rPr>
+          <w:b/>
+          <w:bCs/>
+        </w:rPr>
+      </w:pPr>
+      <w:r>
+        <w:rPr>
+          <w:b/>
+          <w:bCs/>
+        </w:rPr>
+        <w:t>NP Peterson Algorithm</w:t>
+      </w:r>
+    </w:p>
+    <w:p>
+      <w:pPr>
+        <w:numPr>
+          <w:ilvl w:val="0"/>
+          <w:numId w:val="10"/>
+        </w:numPr>
+        <w:rPr>
+          <w:b/>
+          <w:bCs/>
+        </w:rPr>
+      </w:pPr>
+      <w:r>
+        <w:rPr>
+          <w:b/>
+          <w:bCs/>
+        </w:rPr>
+        <w:t>Bakery Algorithm</w:t>
+      </w:r>
+    </w:p>
+    <w:p>
+      <w:pPr>
+        <w:rPr>
+          <w:b/>
+          <w:bCs/>
+        </w:rPr>
+      </w:pPr>
+    </w:p>
+    <w:p>
+      <w:pPr>
+        <w:rPr>
+          <w:b/>
+          <w:bCs/>
+        </w:rPr>
+      </w:pPr>
+      <w:hyperlink r:id="rId14" w:history="1">
+        <w:proofErr w:type="spellStart"/>
         <w:r>
           <w:rPr>
             <w:rStyle w:val="Hyperlink"/>
             <w:b/>
             <w:bCs/>
           </w:rPr>
-          <w:t>ZohaibRahim/CPSC473_A2</w:t>
+          <w:t>ZohaibRahim</w:t>
+        </w:r>
+        <w:proofErr w:type="spellEnd"/>
+        <w:r>
+          <w:rPr>
+            <w:rStyle w:val="Hyperlink"/>
+            <w:b/>
+            <w:bCs/>
+          </w:rPr>
+          <w:t>/Data-Structures: Data Structures</w:t>
+        </w:r>
+      </w:hyperlink>
+      <w:r>
+        <w:rPr>
+          <w:b/>
+          <w:bCs/>
+        </w:rPr>
+        <w:br/>
+      </w:r>
+      <w:r>
+        <w:rPr>
+          <w:b/>
+          <w:bCs/>
+        </w:rPr>
+        <w:t>Data Structures</w:t>
+      </w:r>
+    </w:p>
+    <w:p>
+      <w:pPr>
+        <w:rPr>
+          <w:b/>
+          <w:bCs/>
+        </w:rPr>
+      </w:pPr>
+      <w:r>
+        <w:rPr>
+          <w:b/>
+          <w:bCs/>
+        </w:rPr>
+        <w:t>Topics</w:t>
+      </w:r>
+    </w:p>
+    <w:p>
+      <w:pPr>
+        <w:numPr>
+          <w:ilvl w:val="0"/>
+          <w:numId w:val="11"/>
+        </w:numPr>
+        <w:rPr>
+          <w:b/>
+          <w:bCs/>
+        </w:rPr>
+      </w:pPr>
+      <w:r>
+        <w:rPr>
+          <w:b/>
+          <w:bCs/>
+        </w:rPr>
+        <w:t>Removing Duplicates</w:t>
+      </w:r>
+    </w:p>
+    <w:p>
+      <w:pPr>
+        <w:numPr>
+          <w:ilvl w:val="0"/>
+          <w:numId w:val="11"/>
+        </w:numPr>
+        <w:rPr>
+          <w:b/>
+          <w:bCs/>
+        </w:rPr>
+      </w:pPr>
+      <w:r>
+        <w:rPr>
+          <w:b/>
+          <w:bCs/>
+        </w:rPr>
+        <w:t>Execution Time Testing</w:t>
+      </w:r>
+    </w:p>
+    <w:p>
+      <w:pPr>
+        <w:numPr>
+          <w:ilvl w:val="1"/>
+          <w:numId w:val="11"/>
+        </w:numPr>
+        <w:rPr>
+          <w:b/>
+          <w:bCs/>
+        </w:rPr>
+      </w:pPr>
+      <w:r>
+        <w:rPr>
+          <w:b/>
+          <w:bCs/>
+        </w:rPr>
+        <w:t>Row-Wise mapping</w:t>
+      </w:r>
+    </w:p>
+    <w:p>
+      <w:pPr>
+        <w:numPr>
+          <w:ilvl w:val="1"/>
+          <w:numId w:val="11"/>
+        </w:numPr>
+        <w:rPr>
+          <w:b/>
+          <w:bCs/>
+        </w:rPr>
+      </w:pPr>
+      <w:r>
+        <w:rPr>
+          <w:b/>
+          <w:bCs/>
+        </w:rPr>
+        <w:t>Column-Wise mapping</w:t>
+      </w:r>
+    </w:p>
+    <w:p>
+      <w:pPr>
+        <w:numPr>
+          <w:ilvl w:val="0"/>
+          <w:numId w:val="11"/>
+        </w:numPr>
+        <w:rPr>
+          <w:b/>
+          <w:bCs/>
+        </w:rPr>
+      </w:pPr>
+      <w:r>
+        <w:rPr>
+          <w:b/>
+          <w:bCs/>
+        </w:rPr>
+        <w:t>Josephus Problem - Circular Linked List</w:t>
+      </w:r>
+    </w:p>
+    <w:p>
+      <w:pPr>
+        <w:numPr>
+          <w:ilvl w:val="0"/>
+          <w:numId w:val="11"/>
+        </w:numPr>
+        <w:rPr>
+          <w:b/>
+          <w:bCs/>
+        </w:rPr>
+      </w:pPr>
+      <w:r>
+        <w:rPr>
+          <w:b/>
+          <w:bCs/>
+        </w:rPr>
+        <w:t xml:space="preserve">Cuckoo </w:t>
+      </w:r>
+      <w:proofErr w:type="spellStart"/>
+      <w:r>
+        <w:rPr>
+          <w:b/>
+          <w:bCs/>
+        </w:rPr>
+        <w:t>Hashmap</w:t>
+      </w:r>
+      <w:proofErr w:type="spellEnd"/>
+    </w:p>
+    <w:p>
+      <w:pPr>
+        <w:numPr>
+          <w:ilvl w:val="0"/>
+          <w:numId w:val="11"/>
+        </w:numPr>
+        <w:rPr>
+          <w:b/>
+          <w:bCs/>
+        </w:rPr>
+      </w:pPr>
+      <w:r>
+        <w:rPr>
+          <w:b/>
+          <w:bCs/>
+        </w:rPr>
+        <w:t>Postfix Expression Evaluation &amp; Infix-to-Postfix Conversion</w:t>
+      </w:r>
+    </w:p>
+    <w:p>
+      <w:pPr>
+        <w:numPr>
+          <w:ilvl w:val="0"/>
+          <w:numId w:val="11"/>
+        </w:numPr>
+        <w:rPr>
+          <w:b/>
+          <w:bCs/>
+        </w:rPr>
+      </w:pPr>
+      <w:r>
+        <w:rPr>
+          <w:b/>
+          <w:bCs/>
+        </w:rPr>
+        <w:t>Merging Singly Linked Lists into a Doubly Linked List</w:t>
+      </w:r>
+    </w:p>
+    <w:p>
+      <w:pPr>
+        <w:numPr>
+          <w:ilvl w:val="0"/>
+          <w:numId w:val="11"/>
+        </w:numPr>
+        <w:rPr>
+          <w:b/>
+          <w:bCs/>
+        </w:rPr>
+      </w:pPr>
+      <w:r>
+        <w:rPr>
+          <w:b/>
+          <w:bCs/>
+        </w:rPr>
+        <w:t>Deque Implementation</w:t>
+      </w:r>
+    </w:p>
+    <w:p>
+      <w:pPr>
+        <w:numPr>
+          <w:ilvl w:val="1"/>
+          <w:numId w:val="11"/>
+        </w:numPr>
+        <w:rPr>
+          <w:b/>
+          <w:bCs/>
+        </w:rPr>
+      </w:pPr>
+      <w:r>
+        <w:rPr>
+          <w:b/>
+          <w:bCs/>
+        </w:rPr>
+        <w:t>Array</w:t>
+      </w:r>
+    </w:p>
+    <w:p>
+      <w:pPr>
+        <w:numPr>
+          <w:ilvl w:val="1"/>
+          <w:numId w:val="11"/>
+        </w:numPr>
+        <w:rPr>
+          <w:b/>
+          <w:bCs/>
+        </w:rPr>
+      </w:pPr>
+      <w:r>
+        <w:rPr>
+          <w:b/>
+          <w:bCs/>
+        </w:rPr>
+        <w:lastRenderedPageBreak/>
+        <w:t>Doubly Linked List</w:t>
+      </w:r>
+    </w:p>
+    <w:p>
+      <w:pPr>
+        <w:numPr>
+          <w:ilvl w:val="0"/>
+          <w:numId w:val="11"/>
+        </w:numPr>
+        <w:rPr>
+          <w:b/>
+          <w:bCs/>
+        </w:rPr>
+      </w:pPr>
+      <w:r>
+        <w:rPr>
+          <w:b/>
+          <w:bCs/>
+        </w:rPr>
+        <w:t>Arithmetic Expression Processing</w:t>
+      </w:r>
+    </w:p>
+    <w:p>
+      <w:pPr>
+        <w:numPr>
+          <w:ilvl w:val="1"/>
+          <w:numId w:val="11"/>
+        </w:numPr>
+        <w:rPr>
+          <w:b/>
+          <w:bCs/>
+        </w:rPr>
+      </w:pPr>
+      <w:r>
+        <w:rPr>
+          <w:b/>
+          <w:bCs/>
+        </w:rPr>
+        <w:t>Infix to Binary</w:t>
+      </w:r>
+    </w:p>
+    <w:p>
+      <w:pPr>
+        <w:numPr>
+          <w:ilvl w:val="1"/>
+          <w:numId w:val="11"/>
+        </w:numPr>
+        <w:rPr>
+          <w:b/>
+          <w:bCs/>
+        </w:rPr>
+      </w:pPr>
+      <w:r>
+        <w:rPr>
+          <w:b/>
+          <w:bCs/>
+        </w:rPr>
+        <w:t>Tree Traversal</w:t>
+      </w:r>
+    </w:p>
+    <w:p>
+      <w:pPr>
+        <w:numPr>
+          <w:ilvl w:val="0"/>
+          <w:numId w:val="11"/>
+        </w:numPr>
+        <w:rPr>
+          <w:b/>
+          <w:bCs/>
+        </w:rPr>
+      </w:pPr>
+      <w:r>
+        <w:rPr>
+          <w:b/>
+          <w:bCs/>
+        </w:rPr>
+        <w:t>Huffman Coding</w:t>
+      </w:r>
+    </w:p>
+    <w:p>
+      <w:pPr>
+        <w:rPr>
+          <w:b/>
+          <w:bCs/>
+        </w:rPr>
+      </w:pPr>
+    </w:p>
+    <w:p>
+      <w:pPr>
+        <w:rPr>
+          <w:b/>
+          <w:bCs/>
+        </w:rPr>
+      </w:pPr>
+      <w:hyperlink r:id="rId15" w:history="1">
+        <w:proofErr w:type="spellStart"/>
+        <w:r>
+          <w:rPr>
+            <w:rStyle w:val="Hyperlink"/>
+            <w:b/>
+            <w:bCs/>
+          </w:rPr>
+          <w:t>ZohaibRahim</w:t>
+        </w:r>
+        <w:proofErr w:type="spellEnd"/>
+        <w:r>
+          <w:rPr>
+            <w:rStyle w:val="Hyperlink"/>
+            <w:b/>
+            <w:bCs/>
+          </w:rPr>
+          <w:t>/Credit-Card-Fraud-Detection</w:t>
+        </w:r>
+      </w:hyperlink>
+    </w:p>
+    <w:p>
+      <w:pPr>
+        <w:rPr>
+          <w:b/>
+          <w:bCs/>
+        </w:rPr>
+      </w:pPr>
+    </w:p>
+    <w:p>
+      <w:hyperlink r:id="rId16" w:history="1">
+        <w:proofErr w:type="spellStart"/>
+        <w:r>
+          <w:rPr>
+            <w:rStyle w:val="Hyperlink"/>
+            <w:b/>
+            <w:bCs/>
+          </w:rPr>
+          <w:t>ZohaibRahim</w:t>
+        </w:r>
+        <w:proofErr w:type="spellEnd"/>
+        <w:r>
+          <w:rPr>
+            <w:rStyle w:val="Hyperlink"/>
+            <w:b/>
+            <w:bCs/>
+          </w:rPr>
+          <w:t>/CPSC473_A2</w:t>
         </w:r>
       </w:hyperlink>
     </w:p>
@@ -1625,6 +2003,82 @@
         </w:r>
       </w:hyperlink>
     </w:p>
+    <w:p/>
+    <w:p>
+      <w:hyperlink r:id="rId21" w:history="1">
+        <w:r>
+          <w:rPr>
+            <w:rStyle w:val="Hyperlink"/>
+          </w:rPr>
+          <w:t>https://learn.microsoft.com/api/achievements/share/en-us/ZohaibRahim6/QL46A76E?sharingId=DA55C0C93A7AC0CF</w:t>
+        </w:r>
+      </w:hyperlink>
+    </w:p>
+    <w:p>
+      <w:hyperlink r:id="rId22" w:history="1">
+        <w:r>
+          <w:rPr>
+            <w:rStyle w:val="Hyperlink"/>
+          </w:rPr>
+          <w:t>https://learn.microsoft.com/api/achievements/share/en-us/ZohaibRahim6/XEDC9PBY?sharingId=DA55C0C93A7AC0CF</w:t>
+        </w:r>
+      </w:hyperlink>
+    </w:p>
+    <w:p>
+      <w:hyperlink r:id="rId23" w:history="1">
+        <w:r>
+          <w:rPr>
+            <w:rStyle w:val="Hyperlink"/>
+          </w:rPr>
+          <w:t>https://learn.microsoft.com/api/achievements/share/en-us/ZohaibRahim6/82P5SUBW?sharingId=DA55C0C93A7AC0CF</w:t>
+        </w:r>
+      </w:hyperlink>
+    </w:p>
+    <w:p>
+      <w:hyperlink r:id="rId24" w:history="1">
+        <w:r>
+          <w:rPr>
+            <w:rStyle w:val="Hyperlink"/>
+          </w:rPr>
+          <w:t>https://learn.microsoft.com/api/achievements/share/en-us/ZohaibRahim6/7B5H8D5Z?sharingId=DA55C0C93A7AC0CF</w:t>
+        </w:r>
+      </w:hyperlink>
+    </w:p>
+    <w:p/>
+    <w:p>
+      <w:proofErr w:type="spellStart"/>
+      <w:r>
+        <w:lastRenderedPageBreak/>
+        <w:t>Roshtay</w:t>
+      </w:r>
+      <w:proofErr w:type="spellEnd"/>
+      <w:r>
+        <w:t xml:space="preserve">: </w:t>
+      </w:r>
+      <w:hyperlink r:id="rId25" w:history="1">
+        <w:r>
+          <w:rPr>
+            <w:rStyle w:val="Hyperlink"/>
+          </w:rPr>
+          <w:t>https://www.roshtay.com</w:t>
+        </w:r>
+      </w:hyperlink>
+    </w:p>
+    <w:p>
+      <w:r>
+        <w:t xml:space="preserve">Portfolio: </w:t>
+      </w:r>
+      <w:hyperlink r:id="rId26" w:history="1">
+        <w:r>
+          <w:rPr>
+            <w:rStyle w:val="Hyperlink"/>
+          </w:rPr>
+          <w:t>https://zohaibrahim.vercel.app</w:t>
+        </w:r>
+      </w:hyperlink>
+    </w:p>
+    <w:p/>
+    <w:p/>
     <w:sectPr>
       <w:pgSz w:w="12240" w:h="15840"/>
       <w:pgMar w:top="1440" w:right="1440" w:bottom="1440" w:left="1440" w:header="708" w:footer="708" w:gutter="0"/>

</xml_diff>